<commit_message>
ETHICS FORM ADDITION AND MODIFICATION
</commit_message>
<xml_diff>
--- a/ethics form (1).docx
+++ b/ethics form (1).docx
@@ -356,7 +356,13 @@
     <w:p/>
     <w:p>
       <w:r>
-        <w:t>Student Name (printed): __________________________</w:t>
+        <w:t>Student Name (printed): __</w:t>
+      </w:r>
+      <w:r>
+        <w:t>Andrea Diaz Medrano</w:t>
+      </w:r>
+      <w:r>
+        <w:t>_____</w:t>
       </w:r>
     </w:p>
     <w:p/>

</xml_diff>